<commit_message>
fix: typo in destroyed template
</commit_message>
<xml_diff>
--- a/certificate_generator/report_templates/heritage-recommendation-destroyed_v7.docx
+++ b/certificate_generator/report_templates/heritage-recommendation-destroyed_v7.docx
@@ -2534,6 +2534,20 @@
           <w:lang w:val="en-AU"/>
         </w:rPr>
         <w:t>References</w:t>
+      </w:r>
+      <w:r>
+        <w:rPr>
+          <w:rFonts w:ascii="Calibri Light" w:hAnsi="Calibri Light" w:eastAsia="Calibri Light" w:cs="Calibri Light"/>
+          <w:b w:val="0"/>
+          <w:bCs w:val="0"/>
+          <w:i w:val="0"/>
+          <w:iCs w:val="0"/>
+          <w:noProof w:val="0"/>
+          <w:sz w:val="22"/>
+          <w:szCs w:val="22"/>
+          <w:lang w:val="en-AU"/>
+        </w:rPr>
+        <w:t>{</w:t>
       </w:r>
       <w:r>
         <w:rPr>

</xml_diff>

<commit_message>
fix: typo in heritage recommendation destroyed template
</commit_message>
<xml_diff>
--- a/certificate_generator/report_templates/heritage-recommendation-destroyed_v7.docx
+++ b/certificate_generator/report_templates/heritage-recommendation-destroyed_v7.docx
@@ -28,8 +28,6 @@
       </w:r>
       <w:r>
         <w:tab/>
-      </w:r>
-      <w:r>
         <w:tab/>
       </w:r>
       <w:r>
@@ -2547,49 +2545,7 @@
           <w:szCs w:val="22"/>
           <w:lang w:val="en-AU"/>
         </w:rPr>
-        <w:t>{</w:t>
-      </w:r>
-      <w:r>
-        <w:rPr>
-          <w:rFonts w:ascii="Calibri Light" w:hAnsi="Calibri Light" w:eastAsia="Calibri Light" w:cs="Calibri Light"/>
-          <w:b w:val="0"/>
-          <w:bCs w:val="0"/>
-          <w:i w:val="0"/>
-          <w:iCs w:val="0"/>
-          <w:noProof w:val="0"/>
-          <w:sz w:val="22"/>
-          <w:szCs w:val="22"/>
-          <w:lang w:val="en-AU"/>
-        </w:rPr>
-        <w:t xml:space="preserve">% for para in </w:t>
-      </w:r>
-      <w:r>
-        <w:rPr>
-          <w:rFonts w:ascii="Calibri Light" w:hAnsi="Calibri Light" w:eastAsia="Calibri Light" w:cs="Calibri Light"/>
-          <w:b w:val="0"/>
-          <w:bCs w:val="0"/>
-          <w:i w:val="0"/>
-          <w:iCs w:val="0"/>
-          <w:noProof w:val="0"/>
-          <w:sz w:val="22"/>
-          <w:szCs w:val="22"/>
-          <w:lang w:val="en-AU"/>
-        </w:rPr>
-        <w:t>desc.description</w:t>
-      </w:r>
-      <w:r>
-        <w:rPr>
-          <w:rFonts w:ascii="Calibri Light" w:hAnsi="Calibri Light" w:eastAsia="Calibri Light" w:cs="Calibri Light"/>
-          <w:b w:val="0"/>
-          <w:bCs w:val="0"/>
-          <w:i w:val="0"/>
-          <w:iCs w:val="0"/>
-          <w:noProof w:val="0"/>
-          <w:sz w:val="22"/>
-          <w:szCs w:val="22"/>
-          <w:lang w:val="en-AU"/>
-        </w:rPr>
-        <w:t>|mark2html %}</w:t>
+        <w:t>{% for para in desc.description|mark2html %}</w:t>
       </w:r>
     </w:p>
     <w:p>
@@ -2903,7 +2859,7 @@
                           </w:sdtPr>
                           <w:sdtEndPr/>
                           <w:sdtContent>
-                            <w:p xmlns:wp14="http://schemas.microsoft.com/office/word/2010/wordml" wp14:textId="77777777">
+                            <w:p>
                               <w:pPr>
                                 <w:tabs>
                                   <w:tab w:val="center" w:pos="4513"/>
@@ -2916,7 +2872,7 @@
                                 </w:rPr>
                               </w:pPr>
                             </w:p>
-                            <w:p xmlns:wp14="http://schemas.microsoft.com/office/word/2010/wordml" wp14:textId="77777777">
+                            <w:p>
                               <w:pPr>
                                 <w:tabs>
                                   <w:tab w:val="center" w:pos="4513"/>
@@ -2929,7 +2885,7 @@
                                 </w:rPr>
                               </w:pPr>
                             </w:p>
-                            <w:p xmlns:wp14="http://schemas.microsoft.com/office/word/2010/wordml" wp14:textId="77777777">
+                            <w:p>
                               <w:pPr>
                                 <w:tabs>
                                   <w:tab w:val="center" w:pos="4513"/>
@@ -2944,14 +2900,14 @@
                                 </w:rPr>
                               </w:pPr>
                             </w:p>
-                            <w:p xmlns:wp14="http://schemas.microsoft.com/office/word/2010/wordml" wp14:textId="77777777">
+                            <w:p>
                               <w:pPr>
                                 <w:rPr>
                                   <w:color w:val="FFFFFF"/>
                                 </w:rPr>
                               </w:pPr>
                             </w:p>
-                            <w:p xmlns:wp14="http://schemas.microsoft.com/office/word/2010/wordml" wp14:textId="77777777">
+                            <w:p>
                               <w:pPr>
                                 <w:spacing w:after="200"/>
                                 <w:jc w:val="center"/>

</xml_diff>